<commit_message>
Fix typo in real life conditionals worksheet
</commit_message>
<xml_diff>
--- a/CourseMaterials/course_energizers/02_real_life_conditionals/conditionals_worksheet_long.docx
+++ b/CourseMaterials/course_energizers/02_real_life_conditionals/conditionals_worksheet_long.docx
@@ -1,6 +1,6 @@
 
 <file path=word/document.xml><?xml version="1.0" encoding="utf-8"?>
-<w:document xmlns:wpc="http://schemas.microsoft.com/office/word/2010/wordprocessingCanvas" xmlns:cx="http://schemas.microsoft.com/office/drawing/2014/chartex" xmlns:cx1="http://schemas.microsoft.com/office/drawing/2015/9/8/chartex" xmlns:cx2="http://schemas.microsoft.com/office/drawing/2015/10/21/chartex" xmlns:cx3="http://schemas.microsoft.com/office/drawing/2016/5/9/chartex" xmlns:cx4="http://schemas.microsoft.com/office/drawing/2016/5/10/chartex" xmlns:cx5="http://schemas.microsoft.com/office/drawing/2016/5/11/chartex" xmlns:cx6="http://schemas.microsoft.com/office/drawing/2016/5/12/chartex" xmlns:cx7="http://schemas.microsoft.com/office/drawing/2016/5/13/chartex" xmlns:cx8="http://schemas.microsoft.com/office/drawing/2016/5/14/chartex" xmlns:mc="http://schemas.openxmlformats.org/markup-compatibility/2006" xmlns:aink="http://schemas.microsoft.com/office/drawing/2016/ink" xmlns:am3d="http://schemas.microsoft.com/office/drawing/2017/model3d" xmlns:o="urn:schemas-microsoft-com:office:office" xmlns:oel="http://schemas.microsoft.com/office/2019/extlst" xmlns:r="http://schemas.openxmlformats.org/officeDocument/2006/relationships" xmlns:m="http://schemas.openxmlformats.org/officeDocument/2006/math" xmlns:v="urn:schemas-microsoft-com:vml" xmlns:wp14="http://schemas.microsoft.com/office/word/2010/wordprocessingDrawing" xmlns:wp="http://schemas.openxmlformats.org/drawingml/2006/wordprocessingDrawing" xmlns:w10="urn:schemas-microsoft-com:office:word" xmlns:w="http://schemas.openxmlformats.org/wordprocessingml/2006/main" xmlns:w14="http://schemas.microsoft.com/office/word/2010/wordml" xmlns:w15="http://schemas.microsoft.com/office/word/2012/wordml" xmlns:w16cex="http://schemas.microsoft.com/office/word/2018/wordml/cex" xmlns:w16cid="http://schemas.microsoft.com/office/word/2016/wordml/cid" xmlns:w16="http://schemas.microsoft.com/office/word/2018/wordml" xmlns:w16sdtdh="http://schemas.microsoft.com/office/word/2020/wordml/sdtdatahash" xmlns:w16se="http://schemas.microsoft.com/office/word/2015/wordml/symex" xmlns:wpg="http://schemas.microsoft.com/office/word/2010/wordprocessingGroup" xmlns:wpi="http://schemas.microsoft.com/office/word/2010/wordprocessingInk" xmlns:wne="http://schemas.microsoft.com/office/word/2006/wordml" xmlns:wps="http://schemas.microsoft.com/office/word/2010/wordprocessingShape" mc:Ignorable="w14 w15 w16se w16cid w16 w16cex w16sdtdh wp14">
+<w:document xmlns:wpc="http://schemas.microsoft.com/office/word/2010/wordprocessingCanvas" xmlns:cx="http://schemas.microsoft.com/office/drawing/2014/chartex" xmlns:cx1="http://schemas.microsoft.com/office/drawing/2015/9/8/chartex" xmlns:cx2="http://schemas.microsoft.com/office/drawing/2015/10/21/chartex" xmlns:cx3="http://schemas.microsoft.com/office/drawing/2016/5/9/chartex" xmlns:cx4="http://schemas.microsoft.com/office/drawing/2016/5/10/chartex" xmlns:cx5="http://schemas.microsoft.com/office/drawing/2016/5/11/chartex" xmlns:cx6="http://schemas.microsoft.com/office/drawing/2016/5/12/chartex" xmlns:cx7="http://schemas.microsoft.com/office/drawing/2016/5/13/chartex" xmlns:cx8="http://schemas.microsoft.com/office/drawing/2016/5/14/chartex" xmlns:mc="http://schemas.openxmlformats.org/markup-compatibility/2006" xmlns:aink="http://schemas.microsoft.com/office/drawing/2016/ink" xmlns:am3d="http://schemas.microsoft.com/office/drawing/2017/model3d" xmlns:o="urn:schemas-microsoft-com:office:office" xmlns:oel="http://schemas.microsoft.com/office/2019/extlst" xmlns:r="http://schemas.openxmlformats.org/officeDocument/2006/relationships" xmlns:m="http://schemas.openxmlformats.org/officeDocument/2006/math" xmlns:v="urn:schemas-microsoft-com:vml" xmlns:wp14="http://schemas.microsoft.com/office/word/2010/wordprocessingDrawing" xmlns:wp="http://schemas.openxmlformats.org/drawingml/2006/wordprocessingDrawing" xmlns:w10="urn:schemas-microsoft-com:office:word" xmlns:w="http://schemas.openxmlformats.org/wordprocessingml/2006/main" xmlns:w14="http://schemas.microsoft.com/office/word/2010/wordml" xmlns:w15="http://schemas.microsoft.com/office/word/2012/wordml" xmlns:w16cex="http://schemas.microsoft.com/office/word/2018/wordml/cex" xmlns:w16cid="http://schemas.microsoft.com/office/word/2016/wordml/cid" xmlns:w16="http://schemas.microsoft.com/office/word/2018/wordml" xmlns:w16du="http://schemas.microsoft.com/office/word/2023/wordml/word16du" xmlns:w16sdtdh="http://schemas.microsoft.com/office/word/2020/wordml/sdtdatahash" xmlns:w16sdtfl="http://schemas.microsoft.com/office/word/2024/wordml/sdtformatlock" xmlns:w16se="http://schemas.microsoft.com/office/word/2015/wordml/symex" xmlns:wpg="http://schemas.microsoft.com/office/word/2010/wordprocessingGroup" xmlns:wpi="http://schemas.microsoft.com/office/word/2010/wordprocessingInk" xmlns:wne="http://schemas.microsoft.com/office/word/2006/wordml" xmlns:wps="http://schemas.microsoft.com/office/word/2010/wordprocessingShape" mc:Ignorable="w14 w15 w16se w16cid w16 w16cex w16sdtdh w16sdtfl w16du wp14">
   <w:body>
     <w:p>
       <w:pPr>
@@ -78,7 +78,19 @@
         <w:rPr>
           <w:rFonts w:ascii="Garamond" w:hAnsi="Garamond"/>
         </w:rPr>
-        <w:t>as well as your own action statements to describe, in general, how you go through the day. You don’t need to include every detail and you can skip chucks of time.</w:t>
+        <w:t>as well as your own action statements to describe, in general, how you go through the day. You don’t need to include every detail</w:t>
+      </w:r>
+      <w:r>
+        <w:rPr>
+          <w:rFonts w:ascii="Garamond" w:hAnsi="Garamond"/>
+        </w:rPr>
+        <w:t>,</w:t>
+      </w:r>
+      <w:r>
+        <w:rPr>
+          <w:rFonts w:ascii="Garamond" w:hAnsi="Garamond"/>
+        </w:rPr>
+        <w:t xml:space="preserve"> and you can skip chucks of time.</w:t>
       </w:r>
     </w:p>
     <w:p>
@@ -361,7 +373,6 @@
               </w:rPr>
               <w:t xml:space="preserve">    Do </w:t>
             </w:r>
-            <w:proofErr w:type="gramStart"/>
             <w:r>
               <w:rPr>
                 <w:rFonts w:ascii="Menlo" w:hAnsi="Menlo" w:cs="Menlo"/>
@@ -374,7 +385,6 @@
               </w:rPr>
               <w:t>omething</w:t>
             </w:r>
-            <w:proofErr w:type="gramEnd"/>
           </w:p>
           <w:p>
             <w:pPr>
@@ -483,51 +493,35 @@
               <w:rPr>
                 <w:rFonts w:ascii="Menlo" w:hAnsi="Menlo" w:cs="Menlo"/>
               </w:rPr>
-              <w:t xml:space="preserve">    move 1 space </w:t>
-            </w:r>
-            <w:proofErr w:type="gramStart"/>
-            <w:r>
-              <w:rPr>
-                <w:rFonts w:ascii="Menlo" w:hAnsi="Menlo" w:cs="Menlo"/>
-              </w:rPr>
-              <w:t>down</w:t>
-            </w:r>
-            <w:proofErr w:type="gramEnd"/>
-          </w:p>
-          <w:p>
-            <w:pPr>
-              <w:rPr>
-                <w:rFonts w:ascii="Menlo" w:hAnsi="Menlo" w:cs="Menlo"/>
-              </w:rPr>
-            </w:pPr>
-          </w:p>
-          <w:p>
-            <w:pPr>
-              <w:rPr>
-                <w:rFonts w:ascii="Menlo" w:hAnsi="Menlo" w:cs="Menlo"/>
-              </w:rPr>
-            </w:pPr>
-          </w:p>
-          <w:p>
-            <w:pPr>
-              <w:rPr>
-                <w:rFonts w:ascii="Menlo" w:hAnsi="Menlo" w:cs="Menlo"/>
-              </w:rPr>
-            </w:pPr>
-            <w:r>
-              <w:rPr>
-                <w:rFonts w:ascii="Menlo" w:hAnsi="Menlo" w:cs="Menlo"/>
-              </w:rPr>
-              <w:t xml:space="preserve">pull into </w:t>
-            </w:r>
-            <w:proofErr w:type="gramStart"/>
-            <w:r>
-              <w:rPr>
-                <w:rFonts w:ascii="Menlo" w:hAnsi="Menlo" w:cs="Menlo"/>
-              </w:rPr>
-              <w:t>space</w:t>
-            </w:r>
-            <w:proofErr w:type="gramEnd"/>
+              <w:t xml:space="preserve">    move 1 space down</w:t>
+            </w:r>
+          </w:p>
+          <w:p>
+            <w:pPr>
+              <w:rPr>
+                <w:rFonts w:ascii="Menlo" w:hAnsi="Menlo" w:cs="Menlo"/>
+              </w:rPr>
+            </w:pPr>
+          </w:p>
+          <w:p>
+            <w:pPr>
+              <w:rPr>
+                <w:rFonts w:ascii="Menlo" w:hAnsi="Menlo" w:cs="Menlo"/>
+              </w:rPr>
+            </w:pPr>
+          </w:p>
+          <w:p>
+            <w:pPr>
+              <w:rPr>
+                <w:rFonts w:ascii="Menlo" w:hAnsi="Menlo" w:cs="Menlo"/>
+              </w:rPr>
+            </w:pPr>
+            <w:r>
+              <w:rPr>
+                <w:rFonts w:ascii="Menlo" w:hAnsi="Menlo" w:cs="Menlo"/>
+              </w:rPr>
+              <w:t>pull into space</w:t>
+            </w:r>
           </w:p>
           <w:p>
             <w:pPr>
@@ -604,51 +598,35 @@
               <w:rPr>
                 <w:rFonts w:ascii="Menlo" w:hAnsi="Menlo" w:cs="Menlo"/>
               </w:rPr>
-              <w:t xml:space="preserve">    fling open </w:t>
-            </w:r>
-            <w:proofErr w:type="gramStart"/>
-            <w:r>
-              <w:rPr>
-                <w:rFonts w:ascii="Menlo" w:hAnsi="Menlo" w:cs="Menlo"/>
-              </w:rPr>
-              <w:t>dramatically</w:t>
-            </w:r>
-            <w:proofErr w:type="gramEnd"/>
-          </w:p>
-          <w:p>
-            <w:pPr>
-              <w:rPr>
-                <w:rFonts w:ascii="Menlo" w:hAnsi="Menlo" w:cs="Menlo"/>
-              </w:rPr>
-            </w:pPr>
-          </w:p>
-          <w:p>
-            <w:pPr>
-              <w:rPr>
-                <w:rFonts w:ascii="Menlo" w:hAnsi="Menlo" w:cs="Menlo"/>
-              </w:rPr>
-            </w:pPr>
-          </w:p>
-          <w:p>
-            <w:pPr>
-              <w:rPr>
-                <w:rFonts w:ascii="Menlo" w:hAnsi="Menlo" w:cs="Menlo"/>
-              </w:rPr>
-            </w:pPr>
-            <w:r>
-              <w:rPr>
-                <w:rFonts w:ascii="Menlo" w:hAnsi="Menlo" w:cs="Menlo"/>
-              </w:rPr>
-              <w:t xml:space="preserve">go up </w:t>
-            </w:r>
-            <w:proofErr w:type="gramStart"/>
-            <w:r>
-              <w:rPr>
-                <w:rFonts w:ascii="Menlo" w:hAnsi="Menlo" w:cs="Menlo"/>
-              </w:rPr>
-              <w:t>stairs</w:t>
-            </w:r>
-            <w:proofErr w:type="gramEnd"/>
+              <w:t xml:space="preserve">    fling open dramatically</w:t>
+            </w:r>
+          </w:p>
+          <w:p>
+            <w:pPr>
+              <w:rPr>
+                <w:rFonts w:ascii="Menlo" w:hAnsi="Menlo" w:cs="Menlo"/>
+              </w:rPr>
+            </w:pPr>
+          </w:p>
+          <w:p>
+            <w:pPr>
+              <w:rPr>
+                <w:rFonts w:ascii="Menlo" w:hAnsi="Menlo" w:cs="Menlo"/>
+              </w:rPr>
+            </w:pPr>
+          </w:p>
+          <w:p>
+            <w:pPr>
+              <w:rPr>
+                <w:rFonts w:ascii="Menlo" w:hAnsi="Menlo" w:cs="Menlo"/>
+              </w:rPr>
+            </w:pPr>
+            <w:r>
+              <w:rPr>
+                <w:rFonts w:ascii="Menlo" w:hAnsi="Menlo" w:cs="Menlo"/>
+              </w:rPr>
+              <w:t>go up stairs</w:t>
+            </w:r>
           </w:p>
           <w:p>
             <w:pPr>
@@ -720,16 +698,8 @@
               <w:rPr>
                 <w:rFonts w:ascii="Menlo" w:hAnsi="Menlo" w:cs="Menlo"/>
               </w:rPr>
-              <w:t xml:space="preserve">go through </w:t>
-            </w:r>
-            <w:proofErr w:type="gramStart"/>
-            <w:r>
-              <w:rPr>
-                <w:rFonts w:ascii="Menlo" w:hAnsi="Menlo" w:cs="Menlo"/>
-              </w:rPr>
-              <w:t>door</w:t>
-            </w:r>
-            <w:proofErr w:type="gramEnd"/>
+              <w:t>go through door</w:t>
+            </w:r>
           </w:p>
           <w:p>
             <w:pPr>
@@ -774,16 +744,8 @@
               <w:rPr>
                 <w:rFonts w:ascii="Menlo" w:hAnsi="Menlo" w:cs="Menlo"/>
               </w:rPr>
-              <w:t xml:space="preserve">    go to </w:t>
-            </w:r>
-            <w:proofErr w:type="gramStart"/>
-            <w:r>
-              <w:rPr>
-                <w:rFonts w:ascii="Menlo" w:hAnsi="Menlo" w:cs="Menlo"/>
-              </w:rPr>
-              <w:t>class</w:t>
-            </w:r>
-            <w:proofErr w:type="gramEnd"/>
+              <w:t xml:space="preserve">    go to class</w:t>
+            </w:r>
           </w:p>
           <w:p>
             <w:pPr>
@@ -809,16 +771,8 @@
               <w:rPr>
                 <w:rFonts w:ascii="Menlo" w:hAnsi="Menlo" w:cs="Menlo"/>
               </w:rPr>
-              <w:t xml:space="preserve">    leave </w:t>
-            </w:r>
-            <w:proofErr w:type="gramStart"/>
-            <w:r>
-              <w:rPr>
-                <w:rFonts w:ascii="Menlo" w:hAnsi="Menlo" w:cs="Menlo"/>
-              </w:rPr>
-              <w:t>class</w:t>
-            </w:r>
-            <w:proofErr w:type="gramEnd"/>
+              <w:t xml:space="preserve">    leave class</w:t>
+            </w:r>
           </w:p>
           <w:p>
             <w:pPr>
@@ -887,7 +841,6 @@
               </w:rPr>
               <w:t xml:space="preserve">    Do </w:t>
             </w:r>
-            <w:proofErr w:type="gramStart"/>
             <w:r>
               <w:rPr>
                 <w:rFonts w:ascii="Menlo" w:hAnsi="Menlo" w:cs="Menlo"/>
@@ -900,7 +853,6 @@
               </w:rPr>
               <w:t>omething</w:t>
             </w:r>
-            <w:proofErr w:type="gramEnd"/>
           </w:p>
           <w:p>
             <w:pPr>
@@ -945,14 +897,12 @@
               </w:rPr>
               <w:t xml:space="preserve">omething </w:t>
             </w:r>
-            <w:proofErr w:type="gramStart"/>
             <w:r>
               <w:rPr>
                 <w:rFonts w:ascii="Menlo" w:hAnsi="Menlo" w:cs="Menlo"/>
               </w:rPr>
               <w:t>different</w:t>
             </w:r>
-            <w:proofErr w:type="gramEnd"/>
           </w:p>
           <w:p>
             <w:pPr>
@@ -1036,16 +986,8 @@
               <w:rPr>
                 <w:rFonts w:ascii="Menlo" w:hAnsi="Menlo" w:cs="Menlo"/>
               </w:rPr>
-              <w:t xml:space="preserve">    Do </w:t>
-            </w:r>
-            <w:proofErr w:type="gramStart"/>
-            <w:r>
-              <w:rPr>
-                <w:rFonts w:ascii="Menlo" w:hAnsi="Menlo" w:cs="Menlo"/>
-              </w:rPr>
-              <w:t>something</w:t>
-            </w:r>
-            <w:proofErr w:type="gramEnd"/>
+              <w:t xml:space="preserve">    Do something</w:t>
+            </w:r>
           </w:p>
           <w:p>
             <w:pPr>
@@ -1114,7 +1056,7 @@
 </file>
 
 <file path=word/endnotes.xml><?xml version="1.0" encoding="utf-8"?>
-<w:endnotes xmlns:wpc="http://schemas.microsoft.com/office/word/2010/wordprocessingCanvas" xmlns:cx="http://schemas.microsoft.com/office/drawing/2014/chartex" xmlns:cx1="http://schemas.microsoft.com/office/drawing/2015/9/8/chartex" xmlns:cx2="http://schemas.microsoft.com/office/drawing/2015/10/21/chartex" xmlns:cx3="http://schemas.microsoft.com/office/drawing/2016/5/9/chartex" xmlns:cx4="http://schemas.microsoft.com/office/drawing/2016/5/10/chartex" xmlns:cx5="http://schemas.microsoft.com/office/drawing/2016/5/11/chartex" xmlns:cx6="http://schemas.microsoft.com/office/drawing/2016/5/12/chartex" xmlns:cx7="http://schemas.microsoft.com/office/drawing/2016/5/13/chartex" xmlns:cx8="http://schemas.microsoft.com/office/drawing/2016/5/14/chartex" xmlns:mc="http://schemas.openxmlformats.org/markup-compatibility/2006" xmlns:aink="http://schemas.microsoft.com/office/drawing/2016/ink" xmlns:am3d="http://schemas.microsoft.com/office/drawing/2017/model3d" xmlns:o="urn:schemas-microsoft-com:office:office" xmlns:oel="http://schemas.microsoft.com/office/2019/extlst" xmlns:r="http://schemas.openxmlformats.org/officeDocument/2006/relationships" xmlns:m="http://schemas.openxmlformats.org/officeDocument/2006/math" xmlns:v="urn:schemas-microsoft-com:vml" xmlns:wp14="http://schemas.microsoft.com/office/word/2010/wordprocessingDrawing" xmlns:wp="http://schemas.openxmlformats.org/drawingml/2006/wordprocessingDrawing" xmlns:w10="urn:schemas-microsoft-com:office:word" xmlns:w="http://schemas.openxmlformats.org/wordprocessingml/2006/main" xmlns:w14="http://schemas.microsoft.com/office/word/2010/wordml" xmlns:w15="http://schemas.microsoft.com/office/word/2012/wordml" xmlns:w16cex="http://schemas.microsoft.com/office/word/2018/wordml/cex" xmlns:w16cid="http://schemas.microsoft.com/office/word/2016/wordml/cid" xmlns:w16="http://schemas.microsoft.com/office/word/2018/wordml" xmlns:w16sdtdh="http://schemas.microsoft.com/office/word/2020/wordml/sdtdatahash" xmlns:w16se="http://schemas.microsoft.com/office/word/2015/wordml/symex" xmlns:wpg="http://schemas.microsoft.com/office/word/2010/wordprocessingGroup" xmlns:wpi="http://schemas.microsoft.com/office/word/2010/wordprocessingInk" xmlns:wne="http://schemas.microsoft.com/office/word/2006/wordml" xmlns:wps="http://schemas.microsoft.com/office/word/2010/wordprocessingShape" mc:Ignorable="w14 w15 w16se w16cid w16 w16cex w16sdtdh wp14">
+<w:endnotes xmlns:wpc="http://schemas.microsoft.com/office/word/2010/wordprocessingCanvas" xmlns:cx="http://schemas.microsoft.com/office/drawing/2014/chartex" xmlns:cx1="http://schemas.microsoft.com/office/drawing/2015/9/8/chartex" xmlns:cx2="http://schemas.microsoft.com/office/drawing/2015/10/21/chartex" xmlns:cx3="http://schemas.microsoft.com/office/drawing/2016/5/9/chartex" xmlns:cx4="http://schemas.microsoft.com/office/drawing/2016/5/10/chartex" xmlns:cx5="http://schemas.microsoft.com/office/drawing/2016/5/11/chartex" xmlns:cx6="http://schemas.microsoft.com/office/drawing/2016/5/12/chartex" xmlns:cx7="http://schemas.microsoft.com/office/drawing/2016/5/13/chartex" xmlns:cx8="http://schemas.microsoft.com/office/drawing/2016/5/14/chartex" xmlns:mc="http://schemas.openxmlformats.org/markup-compatibility/2006" xmlns:aink="http://schemas.microsoft.com/office/drawing/2016/ink" xmlns:am3d="http://schemas.microsoft.com/office/drawing/2017/model3d" xmlns:o="urn:schemas-microsoft-com:office:office" xmlns:oel="http://schemas.microsoft.com/office/2019/extlst" xmlns:r="http://schemas.openxmlformats.org/officeDocument/2006/relationships" xmlns:m="http://schemas.openxmlformats.org/officeDocument/2006/math" xmlns:v="urn:schemas-microsoft-com:vml" xmlns:wp14="http://schemas.microsoft.com/office/word/2010/wordprocessingDrawing" xmlns:wp="http://schemas.openxmlformats.org/drawingml/2006/wordprocessingDrawing" xmlns:w10="urn:schemas-microsoft-com:office:word" xmlns:w="http://schemas.openxmlformats.org/wordprocessingml/2006/main" xmlns:w14="http://schemas.microsoft.com/office/word/2010/wordml" xmlns:w15="http://schemas.microsoft.com/office/word/2012/wordml" xmlns:w16cex="http://schemas.microsoft.com/office/word/2018/wordml/cex" xmlns:w16cid="http://schemas.microsoft.com/office/word/2016/wordml/cid" xmlns:w16="http://schemas.microsoft.com/office/word/2018/wordml" xmlns:w16du="http://schemas.microsoft.com/office/word/2023/wordml/word16du" xmlns:w16sdtdh="http://schemas.microsoft.com/office/word/2020/wordml/sdtdatahash" xmlns:w16sdtfl="http://schemas.microsoft.com/office/word/2024/wordml/sdtformatlock" xmlns:w16se="http://schemas.microsoft.com/office/word/2015/wordml/symex" xmlns:wpg="http://schemas.microsoft.com/office/word/2010/wordprocessingGroup" xmlns:wpi="http://schemas.microsoft.com/office/word/2010/wordprocessingInk" xmlns:wne="http://schemas.microsoft.com/office/word/2006/wordml" xmlns:wps="http://schemas.microsoft.com/office/word/2010/wordprocessingShape" mc:Ignorable="w14 w15 w16se w16cid w16 w16cex w16sdtdh w16sdtfl w16du wp14">
   <w:endnote w:type="separator" w:id="-1">
     <w:p>
       <w:r>
@@ -1133,7 +1075,7 @@
 </file>
 
 <file path=word/footnotes.xml><?xml version="1.0" encoding="utf-8"?>
-<w:footnotes xmlns:wpc="http://schemas.microsoft.com/office/word/2010/wordprocessingCanvas" xmlns:cx="http://schemas.microsoft.com/office/drawing/2014/chartex" xmlns:cx1="http://schemas.microsoft.com/office/drawing/2015/9/8/chartex" xmlns:cx2="http://schemas.microsoft.com/office/drawing/2015/10/21/chartex" xmlns:cx3="http://schemas.microsoft.com/office/drawing/2016/5/9/chartex" xmlns:cx4="http://schemas.microsoft.com/office/drawing/2016/5/10/chartex" xmlns:cx5="http://schemas.microsoft.com/office/drawing/2016/5/11/chartex" xmlns:cx6="http://schemas.microsoft.com/office/drawing/2016/5/12/chartex" xmlns:cx7="http://schemas.microsoft.com/office/drawing/2016/5/13/chartex" xmlns:cx8="http://schemas.microsoft.com/office/drawing/2016/5/14/chartex" xmlns:mc="http://schemas.openxmlformats.org/markup-compatibility/2006" xmlns:aink="http://schemas.microsoft.com/office/drawing/2016/ink" xmlns:am3d="http://schemas.microsoft.com/office/drawing/2017/model3d" xmlns:o="urn:schemas-microsoft-com:office:office" xmlns:oel="http://schemas.microsoft.com/office/2019/extlst" xmlns:r="http://schemas.openxmlformats.org/officeDocument/2006/relationships" xmlns:m="http://schemas.openxmlformats.org/officeDocument/2006/math" xmlns:v="urn:schemas-microsoft-com:vml" xmlns:wp14="http://schemas.microsoft.com/office/word/2010/wordprocessingDrawing" xmlns:wp="http://schemas.openxmlformats.org/drawingml/2006/wordprocessingDrawing" xmlns:w10="urn:schemas-microsoft-com:office:word" xmlns:w="http://schemas.openxmlformats.org/wordprocessingml/2006/main" xmlns:w14="http://schemas.microsoft.com/office/word/2010/wordml" xmlns:w15="http://schemas.microsoft.com/office/word/2012/wordml" xmlns:w16cex="http://schemas.microsoft.com/office/word/2018/wordml/cex" xmlns:w16cid="http://schemas.microsoft.com/office/word/2016/wordml/cid" xmlns:w16="http://schemas.microsoft.com/office/word/2018/wordml" xmlns:w16sdtdh="http://schemas.microsoft.com/office/word/2020/wordml/sdtdatahash" xmlns:w16se="http://schemas.microsoft.com/office/word/2015/wordml/symex" xmlns:wpg="http://schemas.microsoft.com/office/word/2010/wordprocessingGroup" xmlns:wpi="http://schemas.microsoft.com/office/word/2010/wordprocessingInk" xmlns:wne="http://schemas.microsoft.com/office/word/2006/wordml" xmlns:wps="http://schemas.microsoft.com/office/word/2010/wordprocessingShape" mc:Ignorable="w14 w15 w16se w16cid w16 w16cex w16sdtdh wp14">
+<w:footnotes xmlns:wpc="http://schemas.microsoft.com/office/word/2010/wordprocessingCanvas" xmlns:cx="http://schemas.microsoft.com/office/drawing/2014/chartex" xmlns:cx1="http://schemas.microsoft.com/office/drawing/2015/9/8/chartex" xmlns:cx2="http://schemas.microsoft.com/office/drawing/2015/10/21/chartex" xmlns:cx3="http://schemas.microsoft.com/office/drawing/2016/5/9/chartex" xmlns:cx4="http://schemas.microsoft.com/office/drawing/2016/5/10/chartex" xmlns:cx5="http://schemas.microsoft.com/office/drawing/2016/5/11/chartex" xmlns:cx6="http://schemas.microsoft.com/office/drawing/2016/5/12/chartex" xmlns:cx7="http://schemas.microsoft.com/office/drawing/2016/5/13/chartex" xmlns:cx8="http://schemas.microsoft.com/office/drawing/2016/5/14/chartex" xmlns:mc="http://schemas.openxmlformats.org/markup-compatibility/2006" xmlns:aink="http://schemas.microsoft.com/office/drawing/2016/ink" xmlns:am3d="http://schemas.microsoft.com/office/drawing/2017/model3d" xmlns:o="urn:schemas-microsoft-com:office:office" xmlns:oel="http://schemas.microsoft.com/office/2019/extlst" xmlns:r="http://schemas.openxmlformats.org/officeDocument/2006/relationships" xmlns:m="http://schemas.openxmlformats.org/officeDocument/2006/math" xmlns:v="urn:schemas-microsoft-com:vml" xmlns:wp14="http://schemas.microsoft.com/office/word/2010/wordprocessingDrawing" xmlns:wp="http://schemas.openxmlformats.org/drawingml/2006/wordprocessingDrawing" xmlns:w10="urn:schemas-microsoft-com:office:word" xmlns:w="http://schemas.openxmlformats.org/wordprocessingml/2006/main" xmlns:w14="http://schemas.microsoft.com/office/word/2010/wordml" xmlns:w15="http://schemas.microsoft.com/office/word/2012/wordml" xmlns:w16cex="http://schemas.microsoft.com/office/word/2018/wordml/cex" xmlns:w16cid="http://schemas.microsoft.com/office/word/2016/wordml/cid" xmlns:w16="http://schemas.microsoft.com/office/word/2018/wordml" xmlns:w16du="http://schemas.microsoft.com/office/word/2023/wordml/word16du" xmlns:w16sdtdh="http://schemas.microsoft.com/office/word/2020/wordml/sdtdatahash" xmlns:w16sdtfl="http://schemas.microsoft.com/office/word/2024/wordml/sdtformatlock" xmlns:w16se="http://schemas.microsoft.com/office/word/2015/wordml/symex" xmlns:wpg="http://schemas.microsoft.com/office/word/2010/wordprocessingGroup" xmlns:wpi="http://schemas.microsoft.com/office/word/2010/wordprocessingInk" xmlns:wne="http://schemas.microsoft.com/office/word/2006/wordml" xmlns:wps="http://schemas.microsoft.com/office/word/2010/wordprocessingShape" mc:Ignorable="w14 w15 w16se w16cid w16 w16cex w16sdtdh w16sdtfl w16du wp14">
   <w:footnote w:type="separator" w:id="-1">
     <w:p>
       <w:r>
@@ -1152,7 +1094,7 @@
 </file>
 
 <file path=word/numbering.xml><?xml version="1.0" encoding="utf-8"?>
-<w:numbering xmlns:wpc="http://schemas.microsoft.com/office/word/2010/wordprocessingCanvas" xmlns:cx="http://schemas.microsoft.com/office/drawing/2014/chartex" xmlns:cx1="http://schemas.microsoft.com/office/drawing/2015/9/8/chartex" xmlns:cx2="http://schemas.microsoft.com/office/drawing/2015/10/21/chartex" xmlns:cx3="http://schemas.microsoft.com/office/drawing/2016/5/9/chartex" xmlns:cx4="http://schemas.microsoft.com/office/drawing/2016/5/10/chartex" xmlns:cx5="http://schemas.microsoft.com/office/drawing/2016/5/11/chartex" xmlns:cx6="http://schemas.microsoft.com/office/drawing/2016/5/12/chartex" xmlns:cx7="http://schemas.microsoft.com/office/drawing/2016/5/13/chartex" xmlns:cx8="http://schemas.microsoft.com/office/drawing/2016/5/14/chartex" xmlns:mc="http://schemas.openxmlformats.org/markup-compatibility/2006" xmlns:aink="http://schemas.microsoft.com/office/drawing/2016/ink" xmlns:am3d="http://schemas.microsoft.com/office/drawing/2017/model3d" xmlns:o="urn:schemas-microsoft-com:office:office" xmlns:oel="http://schemas.microsoft.com/office/2019/extlst" xmlns:r="http://schemas.openxmlformats.org/officeDocument/2006/relationships" xmlns:m="http://schemas.openxmlformats.org/officeDocument/2006/math" xmlns:v="urn:schemas-microsoft-com:vml" xmlns:wp14="http://schemas.microsoft.com/office/word/2010/wordprocessingDrawing" xmlns:wp="http://schemas.openxmlformats.org/drawingml/2006/wordprocessingDrawing" xmlns:w10="urn:schemas-microsoft-com:office:word" xmlns:w="http://schemas.openxmlformats.org/wordprocessingml/2006/main" xmlns:w14="http://schemas.microsoft.com/office/word/2010/wordml" xmlns:w15="http://schemas.microsoft.com/office/word/2012/wordml" xmlns:w16cex="http://schemas.microsoft.com/office/word/2018/wordml/cex" xmlns:w16cid="http://schemas.microsoft.com/office/word/2016/wordml/cid" xmlns:w16="http://schemas.microsoft.com/office/word/2018/wordml" xmlns:w16sdtdh="http://schemas.microsoft.com/office/word/2020/wordml/sdtdatahash" xmlns:w16se="http://schemas.microsoft.com/office/word/2015/wordml/symex" xmlns:wpg="http://schemas.microsoft.com/office/word/2010/wordprocessingGroup" xmlns:wpi="http://schemas.microsoft.com/office/word/2010/wordprocessingInk" xmlns:wne="http://schemas.microsoft.com/office/word/2006/wordml" xmlns:wps="http://schemas.microsoft.com/office/word/2010/wordprocessingShape" mc:Ignorable="w14 w15 w16se w16cid w16 w16cex w16sdtdh wp14">
+<w:numbering xmlns:wpc="http://schemas.microsoft.com/office/word/2010/wordprocessingCanvas" xmlns:cx="http://schemas.microsoft.com/office/drawing/2014/chartex" xmlns:cx1="http://schemas.microsoft.com/office/drawing/2015/9/8/chartex" xmlns:cx2="http://schemas.microsoft.com/office/drawing/2015/10/21/chartex" xmlns:cx3="http://schemas.microsoft.com/office/drawing/2016/5/9/chartex" xmlns:cx4="http://schemas.microsoft.com/office/drawing/2016/5/10/chartex" xmlns:cx5="http://schemas.microsoft.com/office/drawing/2016/5/11/chartex" xmlns:cx6="http://schemas.microsoft.com/office/drawing/2016/5/12/chartex" xmlns:cx7="http://schemas.microsoft.com/office/drawing/2016/5/13/chartex" xmlns:cx8="http://schemas.microsoft.com/office/drawing/2016/5/14/chartex" xmlns:mc="http://schemas.openxmlformats.org/markup-compatibility/2006" xmlns:aink="http://schemas.microsoft.com/office/drawing/2016/ink" xmlns:am3d="http://schemas.microsoft.com/office/drawing/2017/model3d" xmlns:o="urn:schemas-microsoft-com:office:office" xmlns:oel="http://schemas.microsoft.com/office/2019/extlst" xmlns:r="http://schemas.openxmlformats.org/officeDocument/2006/relationships" xmlns:m="http://schemas.openxmlformats.org/officeDocument/2006/math" xmlns:v="urn:schemas-microsoft-com:vml" xmlns:wp14="http://schemas.microsoft.com/office/word/2010/wordprocessingDrawing" xmlns:wp="http://schemas.openxmlformats.org/drawingml/2006/wordprocessingDrawing" xmlns:w10="urn:schemas-microsoft-com:office:word" xmlns:w="http://schemas.openxmlformats.org/wordprocessingml/2006/main" xmlns:w14="http://schemas.microsoft.com/office/word/2010/wordml" xmlns:w15="http://schemas.microsoft.com/office/word/2012/wordml" xmlns:w16cex="http://schemas.microsoft.com/office/word/2018/wordml/cex" xmlns:w16cid="http://schemas.microsoft.com/office/word/2016/wordml/cid" xmlns:w16="http://schemas.microsoft.com/office/word/2018/wordml" xmlns:w16du="http://schemas.microsoft.com/office/word/2023/wordml/word16du" xmlns:w16sdtdh="http://schemas.microsoft.com/office/word/2020/wordml/sdtdatahash" xmlns:w16sdtfl="http://schemas.microsoft.com/office/word/2024/wordml/sdtformatlock" xmlns:w16se="http://schemas.microsoft.com/office/word/2015/wordml/symex" xmlns:wpg="http://schemas.microsoft.com/office/word/2010/wordprocessingGroup" xmlns:wpi="http://schemas.microsoft.com/office/word/2010/wordprocessingInk" xmlns:wne="http://schemas.microsoft.com/office/word/2006/wordml" xmlns:wps="http://schemas.microsoft.com/office/word/2010/wordprocessingShape" mc:Ignorable="w14 w15 w16se w16cid w16 w16cex w16sdtdh w16sdtfl w16du wp14">
   <w:abstractNum w:abstractNumId="0" w15:restartNumberingAfterBreak="0">
     <w:nsid w:val="19C84D8E"/>
     <w:multiLevelType w:val="hybridMultilevel"/>
@@ -1604,7 +1546,7 @@
 </file>
 
 <file path=word/styles.xml><?xml version="1.0" encoding="utf-8"?>
-<w:styles xmlns:mc="http://schemas.openxmlformats.org/markup-compatibility/2006" xmlns:r="http://schemas.openxmlformats.org/officeDocument/2006/relationships" xmlns:w="http://schemas.openxmlformats.org/wordprocessingml/2006/main" xmlns:w14="http://schemas.microsoft.com/office/word/2010/wordml" xmlns:w15="http://schemas.microsoft.com/office/word/2012/wordml" xmlns:w16cex="http://schemas.microsoft.com/office/word/2018/wordml/cex" xmlns:w16cid="http://schemas.microsoft.com/office/word/2016/wordml/cid" xmlns:w16="http://schemas.microsoft.com/office/word/2018/wordml" xmlns:w16sdtdh="http://schemas.microsoft.com/office/word/2020/wordml/sdtdatahash" xmlns:w16se="http://schemas.microsoft.com/office/word/2015/wordml/symex" mc:Ignorable="w14 w15 w16se w16cid w16 w16cex w16sdtdh">
+<w:styles xmlns:mc="http://schemas.openxmlformats.org/markup-compatibility/2006" xmlns:r="http://schemas.openxmlformats.org/officeDocument/2006/relationships" xmlns:w="http://schemas.openxmlformats.org/wordprocessingml/2006/main" xmlns:w14="http://schemas.microsoft.com/office/word/2010/wordml" xmlns:w15="http://schemas.microsoft.com/office/word/2012/wordml" xmlns:w16cex="http://schemas.microsoft.com/office/word/2018/wordml/cex" xmlns:w16cid="http://schemas.microsoft.com/office/word/2016/wordml/cid" xmlns:w16="http://schemas.microsoft.com/office/word/2018/wordml" xmlns:w16du="http://schemas.microsoft.com/office/word/2023/wordml/word16du" xmlns:w16sdtdh="http://schemas.microsoft.com/office/word/2020/wordml/sdtdatahash" xmlns:w16sdtfl="http://schemas.microsoft.com/office/word/2024/wordml/sdtformatlock" xmlns:w16se="http://schemas.microsoft.com/office/word/2015/wordml/symex" mc:Ignorable="w14 w15 w16se w16cid w16 w16cex w16sdtdh w16sdtfl w16du">
   <w:docDefaults>
     <w:rPrDefault>
       <w:rPr>

</xml_diff>